<commit_message>
Rewrite password report in student voice
</commit_message>
<xml_diff>
--- a/PasswordSecurity/results/final/Password-Security-Display-Board.docx
+++ b/PasswordSecurity/results/final/Password-Security-Display-Board.docx
@@ -55,7 +55,7 @@
     </w:p>
     <w:p>
       <w:r>
-        <w:t>Longer passwords and larger character sets will require exponentially more brute-force guesses. Dictionary attacks will be faster for predictable words but will fail when the target is missing from their candidate list.</w:t>
+        <w:t>I predicted that longer passwords and larger character sets would require exponentially more brute-force guesses. Dictionary attacks will be faster for predictable words but will fail when the target is missing from their candidate list.</w:t>
       </w:r>
     </w:p>
     <w:p>
@@ -103,7 +103,7 @@
         <w:pStyle w:val="ListNumber"/>
       </w:pPr>
       <w:r>
-        <w:t>Wrote a C# password guesser.</w:t>
+        <w:t>I wrote a C# password guesser.</w:t>
       </w:r>
     </w:p>
     <w:p>
@@ -111,7 +111,7 @@
         <w:pStyle w:val="ListNumber"/>
       </w:pPr>
       <w:r>
-        <w:t>Tested four character sets at lengths one through four.</w:t>
+        <w:t>I tested four character sets at lengths one through four.</w:t>
       </w:r>
     </w:p>
     <w:p>
@@ -119,7 +119,7 @@
         <w:pStyle w:val="ListNumber"/>
       </w:pPr>
       <w:r>
-        <w:t>Repeated every baseline condition five times.</w:t>
+        <w:t>I repeated every baseline condition five times.</w:t>
       </w:r>
     </w:p>
     <w:p>
@@ -127,7 +127,7 @@
         <w:pStyle w:val="ListNumber"/>
       </w:pPr>
       <w:r>
-        <w:t>Compared brute force, dictionary, word-pair, and pattern methods.</w:t>
+        <w:t>I compared brute force, dictionary, word-pair, and pattern methods.</w:t>
       </w:r>
     </w:p>
     <w:p>
@@ -135,7 +135,7 @@
         <w:pStyle w:val="ListNumber"/>
       </w:pPr>
       <w:r>
-        <w:t>Tested seven authorized Science Buddies challenge hashes.</w:t>
+        <w:t>I tested seven authorized Science Buddies challenge hashes.</w:t>
       </w:r>
     </w:p>
     <w:p>
@@ -143,7 +143,7 @@
         <w:pStyle w:val="ListNumber"/>
       </w:pPr>
       <w:r>
-        <w:t>Exhausted all 62^6 candidates for Challenge 6.</w:t>
+        <w:t>I exhausted all 62^6 candidates for Challenge 6.</w:t>
       </w:r>
     </w:p>
     <w:p>
@@ -151,7 +151,7 @@
         <w:pStyle w:val="ListNumber"/>
       </w:pPr>
       <w:r>
-        <w:t>Exported CSV data and graphed the results.</w:t>
+        <w:t>I exported the CSV data and graphed the results.</w:t>
       </w:r>
     </w:p>
     <w:p>
@@ -674,7 +674,7 @@
     </w:p>
     <w:p>
       <w:r>
-        <w:t>The hypothesis was supported. Longer, less predictable passwords resisted the tested guessing methods better than short passwords and dictionary words. Length was especially powerful because every new character multiplied the number of candidates. Six of seven challenge passwords were recovered, while Challenge 6 was not found after the complete six-character alphanumeric search.</w:t>
+        <w:t>My hypothesis was supported. Longer, less predictable passwords resisted the tested guessing methods better than short passwords and dictionary words. Length was especially powerful because every new character multiplied the number of candidates. Six of seven challenge passwords were recovered, while Challenge 6 was not found after the complete six-character alphanumeric search.</w:t>
       </w:r>
     </w:p>
     <w:p>
@@ -748,7 +748,7 @@
     </w:p>
     <w:p>
       <w:r>
-        <w:t>Science Buddies supplied the project idea, original Python materials, sample hashes, and word list. The experiment used a commented C# implementation. AI assistance was used for programming, graphs, and report drafting.</w:t>
+        <w:t>Science Buddies supplied the project idea, original Python materials, sample hashes, and word list. I wrote and tested the commented C# version used for my experiment.</w:t>
       </w:r>
     </w:p>
     <w:sectPr>

</xml_diff>